<commit_message>
Default the BGBl.-precedence footer notice on every generated document
</commit_message>
<xml_diff>
--- a/tests/fixtures/renderer_goldens/at-differenzierung/differenzierungsplan.docx
+++ b/tests/fixtures/renderer_goldens/at-differenzierung/differenzierungsplan.docx
@@ -666,6 +666,14 @@
         <w:pStyle w:val="LCSpacer"/>
       </w:pPr>
     </w:p>
+    <w:p>
+      <w:pPr>
+        <w:pStyle w:val="LCMuted"/>
+      </w:pPr>
+      <w:r>
+        <w:t>Konsolidierter RIS-Text, unverbindliche Fassung. Rechtsverbindlich ist die im Bundesgesetzblatt (BGBl.) kundgemachte Fassung.</w:t>
+      </w:r>
+    </w:p>
     <w:sectPr>
       <w:pgSz w:w="12240" w:h="15840"/>
       <w:pgMar w:top="864" w:right="1008" w:bottom="864" w:left="1008" w:header="720" w:footer="720" w:gutter="0"/>

</xml_diff>